<commit_message>
started placing assets in waiting room
</commit_message>
<xml_diff>
--- a/Design Documents/Flaws.docx
+++ b/Design Documents/Flaws.docx
@@ -52,9 +52,23 @@
       </w:pPr>
       <w:r>
         <w:rPr>
-          <w:lang w:val="en-US"/>
-        </w:rPr>
-        <w:t xml:space="preserve">Name: </w:t>
+          <w:b/>
+          <w:bCs/>
+          <w:lang w:val="en-US"/>
+        </w:rPr>
+        <w:t>Name</w:t>
+      </w:r>
+      <w:r>
+        <w:rPr>
+          <w:lang w:val="en-US"/>
+        </w:rPr>
+        <w:t xml:space="preserve">: </w:t>
+      </w:r>
+      <w:r>
+        <w:rPr>
+          <w:lang w:val="en-US"/>
+        </w:rPr>
+        <w:t>Title of the flaw</w:t>
       </w:r>
     </w:p>
     <w:p>
@@ -70,9 +84,23 @@
       </w:pPr>
       <w:r>
         <w:rPr>
-          <w:lang w:val="en-US"/>
-        </w:rPr>
-        <w:t>Description: Short description of the problem</w:t>
+          <w:b/>
+          <w:bCs/>
+          <w:lang w:val="en-US"/>
+        </w:rPr>
+        <w:t>Description</w:t>
+      </w:r>
+      <w:r>
+        <w:rPr>
+          <w:lang w:val="en-US"/>
+        </w:rPr>
+        <w:t xml:space="preserve">: Short description of the </w:t>
+      </w:r>
+      <w:r>
+        <w:rPr>
+          <w:lang w:val="en-US"/>
+        </w:rPr>
+        <w:t>flaw</w:t>
       </w:r>
     </w:p>
     <w:p>
@@ -88,9 +116,29 @@
       </w:pPr>
       <w:r>
         <w:rPr>
-          <w:lang w:val="en-US"/>
-        </w:rPr>
-        <w:t>Origin: The design decision that the problem originates from</w:t>
+          <w:b/>
+          <w:bCs/>
+          <w:lang w:val="en-US"/>
+        </w:rPr>
+        <w:t>Origin</w:t>
+      </w:r>
+      <w:r>
+        <w:rPr>
+          <w:lang w:val="en-US"/>
+        </w:rPr>
+        <w:t xml:space="preserve">: The design decision that the </w:t>
+      </w:r>
+      <w:r>
+        <w:rPr>
+          <w:lang w:val="en-US"/>
+        </w:rPr>
+        <w:t>flaw</w:t>
+      </w:r>
+      <w:r>
+        <w:rPr>
+          <w:lang w:val="en-US"/>
+        </w:rPr>
+        <w:t xml:space="preserve"> originates from</w:t>
       </w:r>
     </w:p>
     <w:p>
@@ -106,9 +154,29 @@
       </w:pPr>
       <w:r>
         <w:rPr>
-          <w:lang w:val="en-US"/>
-        </w:rPr>
-        <w:t>Consequences: How the problem makes the game worse</w:t>
+          <w:b/>
+          <w:bCs/>
+          <w:lang w:val="en-US"/>
+        </w:rPr>
+        <w:t>Consequences</w:t>
+      </w:r>
+      <w:r>
+        <w:rPr>
+          <w:lang w:val="en-US"/>
+        </w:rPr>
+        <w:t xml:space="preserve">: How the </w:t>
+      </w:r>
+      <w:r>
+        <w:rPr>
+          <w:lang w:val="en-US"/>
+        </w:rPr>
+        <w:t>flaw</w:t>
+      </w:r>
+      <w:r>
+        <w:rPr>
+          <w:lang w:val="en-US"/>
+        </w:rPr>
+        <w:t xml:space="preserve"> makes the game worse</w:t>
       </w:r>
     </w:p>
     <w:p>
@@ -124,9 +192,29 @@
       </w:pPr>
       <w:r>
         <w:rPr>
-          <w:lang w:val="en-US"/>
-        </w:rPr>
-        <w:t>Solutions: How to make the problem go away.</w:t>
+          <w:b/>
+          <w:bCs/>
+          <w:lang w:val="en-US"/>
+        </w:rPr>
+        <w:t>Solutions</w:t>
+      </w:r>
+      <w:r>
+        <w:rPr>
+          <w:lang w:val="en-US"/>
+        </w:rPr>
+        <w:t xml:space="preserve">: How to make the </w:t>
+      </w:r>
+      <w:r>
+        <w:rPr>
+          <w:lang w:val="en-US"/>
+        </w:rPr>
+        <w:t>flaw</w:t>
+      </w:r>
+      <w:r>
+        <w:rPr>
+          <w:lang w:val="en-US"/>
+        </w:rPr>
+        <w:t xml:space="preserve"> go away.</w:t>
       </w:r>
     </w:p>
     <w:p>
@@ -273,16 +361,82 @@
         <w:rPr>
           <w:lang w:val="en-US"/>
         </w:rPr>
-        <w:t xml:space="preserve">No reasons to initially engage. No “reasons to </w:t>
+        <w:t>No reasons to initially engage</w:t>
+      </w:r>
+      <w:r>
+        <w:rPr>
+          <w:lang w:val="en-US"/>
+        </w:rPr>
+        <w:t xml:space="preserve"> / </w:t>
+      </w:r>
+      <w:r>
+        <w:rPr>
+          <w:lang w:val="en-US"/>
+        </w:rPr>
+        <w:t xml:space="preserve">“reasons to </w:t>
       </w:r>
       <w:proofErr w:type="gramStart"/>
       <w:r>
         <w:rPr>
           <w:lang w:val="en-US"/>
         </w:rPr>
-        <w:t>care”</w:t>
+        <w:t>care</w:t>
       </w:r>
       <w:proofErr w:type="gramEnd"/>
+      <w:r>
+        <w:rPr>
+          <w:lang w:val="en-US"/>
+        </w:rPr>
+        <w:t>”</w:t>
+      </w:r>
+    </w:p>
+    <w:p>
+      <w:pPr>
+        <w:pStyle w:val="ListParagraph"/>
+        <w:numPr>
+          <w:ilvl w:val="0"/>
+          <w:numId w:val="1"/>
+        </w:numPr>
+        <w:rPr>
+          <w:lang w:val="en-US"/>
+        </w:rPr>
+      </w:pPr>
+      <w:r>
+        <w:rPr>
+          <w:lang w:val="en-US"/>
+        </w:rPr>
+        <w:t>Uncomplete game</w:t>
+      </w:r>
+    </w:p>
+    <w:p>
+      <w:pPr>
+        <w:pStyle w:val="ListParagraph"/>
+        <w:numPr>
+          <w:ilvl w:val="0"/>
+          <w:numId w:val="1"/>
+        </w:numPr>
+        <w:rPr>
+          <w:lang w:val="en-US"/>
+        </w:rPr>
+      </w:pPr>
+      <w:r>
+        <w:rPr>
+          <w:lang w:val="en-US"/>
+        </w:rPr>
+        <w:t>Abysmal optimization</w:t>
+      </w:r>
+    </w:p>
+    <w:p>
+      <w:pPr>
+        <w:pStyle w:val="ListParagraph"/>
+        <w:numPr>
+          <w:ilvl w:val="0"/>
+          <w:numId w:val="1"/>
+        </w:numPr>
+        <w:rPr>
+          <w:lang w:val="en-US"/>
+        </w:rPr>
+      </w:pPr>
     </w:p>
     <w:p>
       <w:pPr>

</xml_diff>